<commit_message>
Publish refined bilingual guide with home page and OBS troubleshooting
</commit_message>
<xml_diff>
--- a/streamplay-guide/downloads/Streamplay-Studio-Guide-EN.docx
+++ b/streamplay-guide/downloads/Streamplay-Studio-Guide-EN.docx
@@ -33,7 +33,7 @@
         <w:snapToGrid w:val="0"/>
       </w:pPr>
       <w:r>
-        <w:t>Content revision 2026-10-22 · 13</w:t>
+        <w:t>Content revision 2026-10-22 · 14</w:t>
       </w:r>
     </w:p>
     <w:p>
@@ -92,12 +92,26 @@
         <w:spacing w:after="60"/>
         <w:snapToGrid w:val="0"/>
       </w:pPr>
+      <w:hyperlink w:anchor="section_home">
+        <w:r>
+          <w:rPr>
+            <w:color w:val="405D78"/>
+          </w:rPr>
+          <w:t>01   Guide home</w:t>
+        </w:r>
+      </w:hyperlink>
+    </w:p>
+    <w:p>
+      <w:pPr>
+        <w:spacing w:after="60"/>
+        <w:snapToGrid w:val="0"/>
+      </w:pPr>
       <w:hyperlink w:anchor="section_download">
         <w:r>
           <w:rPr>
             <w:color w:val="405D78"/>
           </w:rPr>
-          <w:t>01   Download and install</w:t>
+          <w:t>02   Download and install</w:t>
         </w:r>
       </w:hyperlink>
     </w:p>
@@ -111,7 +125,7 @@
           <w:rPr>
             <w:color w:val="405D78"/>
           </w:rPr>
-          <w:t>02   Sign in and switch accounts</w:t>
+          <w:t>03   Sign in and switch accounts</w:t>
         </w:r>
       </w:hyperlink>
     </w:p>
@@ -125,7 +139,7 @@
           <w:rPr>
             <w:color w:val="405D78"/>
           </w:rPr>
-          <w:t>03   Workspace overview</w:t>
+          <w:t>04   Workspace overview</w:t>
         </w:r>
       </w:hyperlink>
     </w:p>
@@ -139,7 +153,7 @@
           <w:rPr>
             <w:color w:val="405D78"/>
           </w:rPr>
-          <w:t>04   Add Cast members</w:t>
+          <w:t>05   Add Cast members</w:t>
         </w:r>
       </w:hyperlink>
     </w:p>
@@ -153,7 +167,7 @@
           <w:rPr>
             <w:color w:val="405D78"/>
           </w:rPr>
-          <w:t>05   Connect camera and OBS</w:t>
+          <w:t>06   Connect camera and OBS</w:t>
         </w:r>
       </w:hyperlink>
     </w:p>
@@ -167,7 +181,7 @@
           <w:rPr>
             <w:color w:val="405D78"/>
           </w:rPr>
-          <w:t>06   Choose a game</w:t>
+          <w:t>07   Choose a game</w:t>
         </w:r>
       </w:hyperlink>
     </w:p>
@@ -181,7 +195,7 @@
           <w:rPr>
             <w:color w:val="405D78"/>
           </w:rPr>
-          <w:t>07   Map representative gifts</w:t>
+          <w:t>08   Map representative gifts</w:t>
         </w:r>
       </w:hyperlink>
     </w:p>
@@ -195,7 +209,7 @@
           <w:rPr>
             <w:color w:val="405D78"/>
           </w:rPr>
-          <w:t>08   Start your first interaction</w:t>
+          <w:t>09   Start your first interaction</w:t>
         </w:r>
       </w:hyperlink>
     </w:p>
@@ -209,7 +223,7 @@
           <w:rPr>
             <w:color w:val="405D78"/>
           </w:rPr>
-          <w:t>09   Group Sticker</w:t>
+          <w:t>10   Group Sticker</w:t>
         </w:r>
       </w:hyperlink>
     </w:p>
@@ -223,7 +237,7 @@
           <w:rPr>
             <w:color w:val="405D78"/>
           </w:rPr>
-          <w:t>10   Group PK</w:t>
+          <w:t>11   Group PK</w:t>
         </w:r>
       </w:hyperlink>
     </w:p>
@@ -237,7 +251,7 @@
           <w:rPr>
             <w:color w:val="405D78"/>
           </w:rPr>
-          <w:t>11   1v1 PK</w:t>
+          <w:t>12   1v1 PK</w:t>
         </w:r>
       </w:hyperlink>
     </w:p>
@@ -251,7 +265,7 @@
           <w:rPr>
             <w:color w:val="405D78"/>
           </w:rPr>
-          <w:t>12   Solo Stage</w:t>
+          <w:t>13   Solo Stage</w:t>
         </w:r>
       </w:hyperlink>
     </w:p>
@@ -265,7 +279,7 @@
           <w:rPr>
             <w:color w:val="405D78"/>
           </w:rPr>
-          <w:t>13   Multi PK</w:t>
+          <w:t>14   Multi PK</w:t>
         </w:r>
       </w:hyperlink>
     </w:p>
@@ -279,7 +293,7 @@
           <w:rPr>
             <w:color w:val="405D78"/>
           </w:rPr>
-          <w:t>14   Other scene tools</w:t>
+          <w:t>15   Other scene tools</w:t>
         </w:r>
       </w:hyperlink>
     </w:p>
@@ -293,7 +307,7 @@
           <w:rPr>
             <w:color w:val="405D78"/>
           </w:rPr>
-          <w:t>15   Finish and review records</w:t>
+          <w:t>16   Finish and review records</w:t>
         </w:r>
       </w:hyperlink>
     </w:p>
@@ -307,21 +321,235 @@
           <w:rPr>
             <w:color w:val="405D78"/>
           </w:rPr>
-          <w:t>16   Troubleshooting</w:t>
+          <w:t>17   Troubleshooting</w:t>
         </w:r>
       </w:hyperlink>
     </w:p>
     <w:p>
-      <w:bookmarkStart w:id="1" w:name="section_download"/>
+      <w:bookmarkStart w:id="1" w:name="section_home"/>
       <w:pPr>
         <w:pStyle w:val="Heading1"/>
         <w:pageBreakBefore/>
         <w:snapToGrid w:val="0"/>
       </w:pPr>
       <w:r>
-        <w:t>01  Download and install</w:t>
+        <w:t>01  Guide home</w:t>
       </w:r>
       <w:bookmarkEnd w:id="1"/>
+    </w:p>
+    <w:p>
+      <w:pPr>
+        <w:snapToGrid w:val="0"/>
+      </w:pPr>
+      <w:r>
+        <w:t>Six steps from installation to your first interactive session.</w:t>
+      </w:r>
+    </w:p>
+    <w:p>
+      <w:pPr>
+        <w:pStyle w:val="Heading2"/>
+        <w:snapToGrid w:val="0"/>
+      </w:pPr>
+      <w:r>
+        <w:t>First session checklist</w:t>
+      </w:r>
+    </w:p>
+    <w:p>
+      <w:pPr>
+        <w:keepNext/>
+        <w:snapToGrid w:val="0"/>
+      </w:pPr>
+      <w:hyperlink w:anchor="section_download">
+        <w:r>
+          <w:rPr>
+            <w:color w:val="405D78"/>
+          </w:rPr>
+          <w:t>Download and install</w:t>
+        </w:r>
+      </w:hyperlink>
+    </w:p>
+    <w:p>
+      <w:pPr>
+        <w:snapToGrid w:val="0"/>
+      </w:pPr>
+      <w:r>
+        <w:t>Choose the installer for your computer.</w:t>
+      </w:r>
+    </w:p>
+    <w:p>
+      <w:pPr>
+        <w:keepNext/>
+        <w:snapToGrid w:val="0"/>
+      </w:pPr>
+      <w:hyperlink w:anchor="section_account">
+        <w:r>
+          <w:rPr>
+            <w:color w:val="405D78"/>
+          </w:rPr>
+          <w:t>Sign in</w:t>
+        </w:r>
+      </w:hyperlink>
+    </w:p>
+    <w:p>
+      <w:pPr>
+        <w:snapToGrid w:val="0"/>
+      </w:pPr>
+      <w:r>
+        <w:t>Check the active Studio account.</w:t>
+      </w:r>
+    </w:p>
+    <w:p>
+      <w:pPr>
+        <w:keepNext/>
+        <w:snapToGrid w:val="0"/>
+      </w:pPr>
+      <w:hyperlink w:anchor="section_cast">
+        <w:r>
+          <w:rPr>
+            <w:color w:val="405D78"/>
+          </w:rPr>
+          <w:t>Add members</w:t>
+        </w:r>
+      </w:hyperlink>
+    </w:p>
+    <w:p>
+      <w:pPr>
+        <w:snapToGrid w:val="0"/>
+      </w:pPr>
+      <w:r>
+        <w:t>Create your Cast roster.</w:t>
+      </w:r>
+    </w:p>
+    <w:p>
+      <w:pPr>
+        <w:keepNext/>
+        <w:snapToGrid w:val="0"/>
+      </w:pPr>
+      <w:hyperlink w:anchor="section_camera">
+        <w:r>
+          <w:rPr>
+            <w:color w:val="405D78"/>
+          </w:rPr>
+          <w:t>Connect video</w:t>
+        </w:r>
+      </w:hyperlink>
+    </w:p>
+    <w:p>
+      <w:pPr>
+        <w:snapToGrid w:val="0"/>
+      </w:pPr>
+      <w:r>
+        <w:t>Set up your camera and OBS game overlay.</w:t>
+      </w:r>
+    </w:p>
+    <w:p>
+      <w:pPr>
+        <w:keepNext/>
+        <w:snapToGrid w:val="0"/>
+      </w:pPr>
+      <w:hyperlink w:anchor="section_modes">
+        <w:r>
+          <w:rPr>
+            <w:color w:val="405D78"/>
+          </w:rPr>
+          <w:t>Choose a game</w:t>
+        </w:r>
+      </w:hyperlink>
+    </w:p>
+    <w:p>
+      <w:pPr>
+        <w:snapToGrid w:val="0"/>
+      </w:pPr>
+      <w:r>
+        <w:t>Configure members, time and gifts where needed.</w:t>
+      </w:r>
+    </w:p>
+    <w:p>
+      <w:pPr>
+        <w:keepNext/>
+        <w:snapToGrid w:val="0"/>
+      </w:pPr>
+      <w:hyperlink w:anchor="section_live">
+        <w:r>
+          <w:rPr>
+            <w:color w:val="405D78"/>
+          </w:rPr>
+          <w:t>Connect LIVE</w:t>
+        </w:r>
+      </w:hyperlink>
+    </w:p>
+    <w:p>
+      <w:pPr>
+        <w:snapToGrid w:val="0"/>
+      </w:pPr>
+      <w:r>
+        <w:t>Go live, connect LIVE data, then start the game.</w:t>
+      </w:r>
+    </w:p>
+    <w:p>
+      <w:pPr>
+        <w:pStyle w:val="Heading2"/>
+        <w:snapToGrid w:val="0"/>
+      </w:pPr>
+      <w:r>
+        <w:t>Quick links</w:t>
+      </w:r>
+    </w:p>
+    <w:p>
+      <w:pPr>
+        <w:pStyle w:val="Heading2"/>
+        <w:snapToGrid w:val="0"/>
+      </w:pPr>
+      <w:hyperlink w:anchor="section_modes">
+        <w:r>
+          <w:rPr>
+            <w:color w:val="000000"/>
+          </w:rPr>
+          <w:t>Game modes</w:t>
+        </w:r>
+      </w:hyperlink>
+    </w:p>
+    <w:p>
+      <w:pPr>
+        <w:snapToGrid w:val="0"/>
+      </w:pPr>
+      <w:r>
+        <w:t>Setup, start, end and next round.</w:t>
+      </w:r>
+    </w:p>
+    <w:p>
+      <w:pPr>
+        <w:pStyle w:val="Heading2"/>
+        <w:snapToGrid w:val="0"/>
+      </w:pPr>
+      <w:hyperlink w:anchor="section_help">
+        <w:r>
+          <w:rPr>
+            <w:color w:val="000000"/>
+          </w:rPr>
+          <w:t>Troubleshooting</w:t>
+        </w:r>
+      </w:hyperlink>
+    </w:p>
+    <w:p>
+      <w:pPr>
+        <w:snapToGrid w:val="0"/>
+      </w:pPr>
+      <w:r>
+        <w:t>Find help by symptom.</w:t>
+      </w:r>
+    </w:p>
+    <w:p>
+      <w:bookmarkStart w:id="2" w:name="section_download"/>
+      <w:pPr>
+        <w:pStyle w:val="Heading1"/>
+        <w:pageBreakBefore/>
+        <w:snapToGrid w:val="0"/>
+      </w:pPr>
+      <w:r>
+        <w:t>02  Download and install</w:t>
+      </w:r>
+      <w:bookmarkEnd w:id="2"/>
     </w:p>
     <w:p>
       <w:pPr>
@@ -412,9 +640,6 @@
         <w:snapToGrid w:val="0"/>
       </w:pPr>
       <w:r>
-        <w:rPr>
-          <w:b/>
-        </w:rPr>
         <w:t xml:space="preserve">Check before continuing: </w:t>
       </w:r>
       <w:r>
@@ -422,16 +647,16 @@
       </w:r>
     </w:p>
     <w:p>
-      <w:bookmarkStart w:id="2" w:name="section_account"/>
+      <w:bookmarkStart w:id="3" w:name="section_account"/>
       <w:pPr>
         <w:pStyle w:val="Heading1"/>
         <w:pageBreakBefore/>
         <w:snapToGrid w:val="0"/>
       </w:pPr>
       <w:r>
-        <w:t>02  Sign in and switch accounts</w:t>
-      </w:r>
-      <w:bookmarkEnd w:id="2"/>
+        <w:t>03  Sign in and switch accounts</w:t>
+      </w:r>
+      <w:bookmarkEnd w:id="3"/>
     </w:p>
     <w:p>
       <w:pPr>
@@ -589,7 +814,7 @@
       <w:r>
         <w:drawing>
           <wp:inline xmlns:a="http://schemas.openxmlformats.org/drawingml/2006/main" xmlns:pic="http://schemas.openxmlformats.org/drawingml/2006/picture">
-            <wp:extent cx="5247266" cy="3291840"/>
+            <wp:extent cx="4518479" cy="2834640"/>
             <wp:docPr id="1" name="Picture 1" descr="Account menu reference: Cast Settings and Switch Account are in this menu"/>
             <wp:cNvGraphicFramePr>
               <a:graphicFrameLocks noChangeAspect="1"/>
@@ -610,7 +835,7 @@
                   <pic:spPr>
                     <a:xfrm>
                       <a:off x="0" y="0"/>
-                      <a:ext cx="5247266" cy="3291840"/>
+                      <a:ext cx="4518479" cy="2834640"/>
                     </a:xfrm>
                     <a:prstGeom prst="rect"/>
                   </pic:spPr>
@@ -670,9 +895,6 @@
         <w:snapToGrid w:val="0"/>
       </w:pPr>
       <w:r>
-        <w:rPr>
-          <w:b/>
-        </w:rPr>
         <w:t xml:space="preserve">Check before continuing: </w:t>
       </w:r>
       <w:r>
@@ -689,7 +911,7 @@
       <w:r>
         <w:drawing>
           <wp:inline xmlns:a="http://schemas.openxmlformats.org/drawingml/2006/main" xmlns:pic="http://schemas.openxmlformats.org/drawingml/2006/picture">
-            <wp:extent cx="5247266" cy="3291840"/>
+            <wp:extent cx="4518479" cy="2834640"/>
             <wp:docPr id="2" name="Picture 2" descr="Switch Account opens the saved account list. Add another account opens the ID and password form."/>
             <wp:cNvGraphicFramePr>
               <a:graphicFrameLocks noChangeAspect="1"/>
@@ -710,7 +932,7 @@
                   <pic:spPr>
                     <a:xfrm>
                       <a:off x="0" y="0"/>
-                      <a:ext cx="5247266" cy="3291840"/>
+                      <a:ext cx="4518479" cy="2834640"/>
                     </a:xfrm>
                     <a:prstGeom prst="rect"/>
                   </pic:spPr>
@@ -740,16 +962,16 @@
       </w:r>
     </w:p>
     <w:p>
-      <w:bookmarkStart w:id="3" w:name="section_start"/>
+      <w:bookmarkStart w:id="4" w:name="section_start"/>
       <w:pPr>
         <w:pStyle w:val="Heading1"/>
         <w:pageBreakBefore/>
         <w:snapToGrid w:val="0"/>
       </w:pPr>
       <w:r>
-        <w:t>03  Workspace overview</w:t>
-      </w:r>
-      <w:bookmarkEnd w:id="3"/>
+        <w:t>04  Workspace overview</w:t>
+      </w:r>
+      <w:bookmarkEnd w:id="4"/>
     </w:p>
     <w:p>
       <w:pPr>
@@ -778,7 +1000,7 @@
       <w:r>
         <w:drawing>
           <wp:inline xmlns:a="http://schemas.openxmlformats.org/drawingml/2006/main" xmlns:pic="http://schemas.openxmlformats.org/drawingml/2006/picture">
-            <wp:extent cx="5247266" cy="3291840"/>
+            <wp:extent cx="4518479" cy="2834640"/>
             <wp:docPr id="3" name="Picture 3" descr="Studio workspace: scenes and games on the left, preview in the middle, LIVE Chat on the right"/>
             <wp:cNvGraphicFramePr>
               <a:graphicFrameLocks noChangeAspect="1"/>
@@ -799,7 +1021,7 @@
                   <pic:spPr>
                     <a:xfrm>
                       <a:off x="0" y="0"/>
-                      <a:ext cx="5247266" cy="3291840"/>
+                      <a:ext cx="4518479" cy="2834640"/>
                     </a:xfrm>
                     <a:prstGeom prst="rect"/>
                   </pic:spPr>
@@ -1180,16 +1402,16 @@
       </w:r>
     </w:p>
     <w:p>
-      <w:bookmarkStart w:id="4" w:name="section_cast"/>
+      <w:bookmarkStart w:id="5" w:name="section_cast"/>
       <w:pPr>
         <w:pStyle w:val="Heading1"/>
         <w:pageBreakBefore/>
         <w:snapToGrid w:val="0"/>
       </w:pPr>
       <w:r>
-        <w:t>04  Add Cast members</w:t>
-      </w:r>
-      <w:bookmarkEnd w:id="4"/>
+        <w:t>05  Add Cast members</w:t>
+      </w:r>
+      <w:bookmarkEnd w:id="5"/>
     </w:p>
     <w:p>
       <w:pPr>
@@ -1235,7 +1457,7 @@
       <w:r>
         <w:drawing>
           <wp:inline xmlns:a="http://schemas.openxmlformats.org/drawingml/2006/main" xmlns:pic="http://schemas.openxmlformats.org/drawingml/2006/picture">
-            <wp:extent cx="5247266" cy="3291840"/>
+            <wp:extent cx="4518479" cy="2834640"/>
             <wp:docPr id="4" name="Picture 4" descr="Where to add members: account menu → Cast Settings"/>
             <wp:cNvGraphicFramePr>
               <a:graphicFrameLocks noChangeAspect="1"/>
@@ -1256,7 +1478,7 @@
                   <pic:spPr>
                     <a:xfrm>
                       <a:off x="0" y="0"/>
-                      <a:ext cx="5247266" cy="3291840"/>
+                      <a:ext cx="4518479" cy="2834640"/>
                     </a:xfrm>
                     <a:prstGeom prst="rect"/>
                   </pic:spPr>
@@ -1296,7 +1518,7 @@
       <w:r>
         <w:drawing>
           <wp:inline xmlns:a="http://schemas.openxmlformats.org/drawingml/2006/main" xmlns:pic="http://schemas.openxmlformats.org/drawingml/2006/picture">
-            <wp:extent cx="5247266" cy="3291840"/>
+            <wp:extent cx="4518479" cy="2834640"/>
             <wp:docPr id="5" name="Picture 5" descr="Added Cast members: h_001022 has a retrieved avatar; test1 and test2 use nickname avatars"/>
             <wp:cNvGraphicFramePr>
               <a:graphicFrameLocks noChangeAspect="1"/>
@@ -1317,7 +1539,7 @@
                   <pic:spPr>
                     <a:xfrm>
                       <a:off x="0" y="0"/>
-                      <a:ext cx="5247266" cy="3291840"/>
+                      <a:ext cx="4518479" cy="2834640"/>
                     </a:xfrm>
                     <a:prstGeom prst="rect"/>
                   </pic:spPr>
@@ -1420,9 +1642,6 @@
         <w:snapToGrid w:val="0"/>
       </w:pPr>
       <w:r>
-        <w:rPr>
-          <w:b/>
-        </w:rPr>
         <w:t xml:space="preserve">Check before continuing: </w:t>
       </w:r>
       <w:r>
@@ -1430,16 +1649,16 @@
       </w:r>
     </w:p>
     <w:p>
-      <w:bookmarkStart w:id="5" w:name="section_camera"/>
+      <w:bookmarkStart w:id="6" w:name="section_camera"/>
       <w:pPr>
         <w:pStyle w:val="Heading1"/>
         <w:pageBreakBefore/>
         <w:snapToGrid w:val="0"/>
       </w:pPr>
       <w:r>
-        <w:t>05  Connect camera and OBS</w:t>
-      </w:r>
-      <w:bookmarkEnd w:id="5"/>
+        <w:t>06  Connect camera and OBS</w:t>
+      </w:r>
+      <w:bookmarkEnd w:id="6"/>
     </w:p>
     <w:p>
       <w:pPr>
@@ -1528,7 +1747,7 @@
       <w:r>
         <w:drawing>
           <wp:inline xmlns:a="http://schemas.openxmlformats.org/drawingml/2006/main" xmlns:pic="http://schemas.openxmlformats.org/drawingml/2006/picture">
-            <wp:extent cx="5247266" cy="3291840"/>
+            <wp:extent cx="4518479" cy="2834640"/>
             <wp:docPr id="6" name="Picture 6" descr="Camera Settings: select a source and refresh devices if needed"/>
             <wp:cNvGraphicFramePr>
               <a:graphicFrameLocks noChangeAspect="1"/>
@@ -1549,7 +1768,7 @@
                   <pic:spPr>
                     <a:xfrm>
                       <a:off x="0" y="0"/>
-                      <a:ext cx="5247266" cy="3291840"/>
+                      <a:ext cx="4518479" cy="2834640"/>
                     </a:xfrm>
                     <a:prstGeom prst="rect"/>
                   </pic:spPr>
@@ -1649,7 +1868,7 @@
       <w:r>
         <w:drawing>
           <wp:inline xmlns:a="http://schemas.openxmlformats.org/drawingml/2006/main" xmlns:pic="http://schemas.openxmlformats.org/drawingml/2006/picture">
-            <wp:extent cx="5247266" cy="3291840"/>
+            <wp:extent cx="4518479" cy="2834640"/>
             <wp:docPr id="7" name="Picture 7" descr="Studio Settings: copy the OBS Overlay Runtime link from your own app"/>
             <wp:cNvGraphicFramePr>
               <a:graphicFrameLocks noChangeAspect="1"/>
@@ -1670,7 +1889,7 @@
                   <pic:spPr>
                     <a:xfrm>
                       <a:off x="0" y="0"/>
-                      <a:ext cx="5247266" cy="3291840"/>
+                      <a:ext cx="4518479" cy="2834640"/>
                     </a:xfrm>
                     <a:prstGeom prst="rect"/>
                   </pic:spPr>
@@ -1704,26 +1923,37 @@
         <w:snapToGrid w:val="0"/>
       </w:pPr>
       <w:r>
+        <w:t xml:space="preserve">Check before continuing: </w:t>
+      </w:r>
+      <w:r>
+        <w:t>The center preview shows video. When a mode runs, its members and scores appear in the OBS Browser source.</w:t>
+      </w:r>
+    </w:p>
+    <w:p>
+      <w:pPr>
+        <w:snapToGrid w:val="0"/>
+      </w:pPr>
+      <w:r>
         <w:rPr>
           <w:b/>
         </w:rPr>
-        <w:t xml:space="preserve">Check before continuing: </w:t>
-      </w:r>
-      <w:r>
-        <w:t>The center preview shows video. When a mode runs, its members and scores appear in the OBS Browser source.</w:t>
-      </w:r>
-    </w:p>
-    <w:p>
-      <w:bookmarkStart w:id="6" w:name="section_modes"/>
+        <w:t>Why does the game not appear in OBS after starting?</w:t>
+      </w:r>
+      <w:r>
+        <w:t xml:space="preserve"> If you have clicked Play / Start / Start round but the game overlay does not appear in OBS, select the Streamplay Browser Source in OBS Sources, open Properties, and click Refresh cache of current page. Then check the overlay again. Refresh the Browser Source, not the camera source.</w:t>
+      </w:r>
+    </w:p>
+    <w:p>
+      <w:bookmarkStart w:id="7" w:name="section_modes"/>
       <w:pPr>
         <w:pStyle w:val="Heading1"/>
         <w:pageBreakBefore/>
         <w:snapToGrid w:val="0"/>
       </w:pPr>
       <w:r>
-        <w:t>06  Choose a game</w:t>
-      </w:r>
-      <w:bookmarkEnd w:id="6"/>
+        <w:t>07  Choose a game</w:t>
+      </w:r>
+      <w:bookmarkEnd w:id="7"/>
     </w:p>
     <w:p>
       <w:pPr>
@@ -1913,16 +2143,16 @@
       </w:r>
     </w:p>
     <w:p>
-      <w:bookmarkStart w:id="7" w:name="section_gifts"/>
+      <w:bookmarkStart w:id="8" w:name="section_gifts"/>
       <w:pPr>
         <w:pStyle w:val="Heading1"/>
         <w:pageBreakBefore/>
         <w:snapToGrid w:val="0"/>
       </w:pPr>
       <w:r>
-        <w:t>07  Map representative gifts</w:t>
-      </w:r>
-      <w:bookmarkEnd w:id="7"/>
+        <w:t>08  Map representative gifts</w:t>
+      </w:r>
+      <w:bookmarkEnd w:id="8"/>
     </w:p>
     <w:p>
       <w:pPr>
@@ -2002,7 +2232,7 @@
       <w:r>
         <w:drawing>
           <wp:inline xmlns:a="http://schemas.openxmlformats.org/drawingml/2006/main" xmlns:pic="http://schemas.openxmlformats.org/drawingml/2006/picture">
-            <wp:extent cx="5247266" cy="3291840"/>
+            <wp:extent cx="4518479" cy="2834640"/>
             <wp:docPr id="8" name="Picture 8" descr="Gift Mapping: each row pairs a member with a gift"/>
             <wp:cNvGraphicFramePr>
               <a:graphicFrameLocks noChangeAspect="1"/>
@@ -2023,7 +2253,7 @@
                   <pic:spPr>
                     <a:xfrm>
                       <a:off x="0" y="0"/>
-                      <a:ext cx="5247266" cy="3291840"/>
+                      <a:ext cx="4518479" cy="2834640"/>
                     </a:xfrm>
                     <a:prstGeom prst="rect"/>
                   </pic:spPr>
@@ -2054,7 +2284,7 @@
       <w:r>
         <w:drawing>
           <wp:inline xmlns:a="http://schemas.openxmlformats.org/drawingml/2006/main" xmlns:pic="http://schemas.openxmlformats.org/drawingml/2006/picture">
-            <wp:extent cx="5247266" cy="3291840"/>
+            <wp:extent cx="4518479" cy="2834640"/>
             <wp:docPr id="9" name="Picture 9" descr="Select Gift: an example search for Rose"/>
             <wp:cNvGraphicFramePr>
               <a:graphicFrameLocks noChangeAspect="1"/>
@@ -2075,7 +2305,7 @@
                   <pic:spPr>
                     <a:xfrm>
                       <a:off x="0" y="0"/>
-                      <a:ext cx="5247266" cy="3291840"/>
+                      <a:ext cx="4518479" cy="2834640"/>
                     </a:xfrm>
                     <a:prstGeom prst="rect"/>
                   </pic:spPr>
@@ -2126,9 +2356,6 @@
         <w:snapToGrid w:val="0"/>
       </w:pPr>
       <w:r>
-        <w:rPr>
-          <w:b/>
-        </w:rPr>
         <w:t xml:space="preserve">Check before continuing: </w:t>
       </w:r>
       <w:r>
@@ -2136,16 +2363,16 @@
       </w:r>
     </w:p>
     <w:p>
-      <w:bookmarkStart w:id="8" w:name="section_live"/>
+      <w:bookmarkStart w:id="9" w:name="section_live"/>
       <w:pPr>
         <w:pStyle w:val="Heading1"/>
         <w:pageBreakBefore/>
         <w:snapToGrid w:val="0"/>
       </w:pPr>
       <w:r>
-        <w:t>08  Start your first interaction</w:t>
-      </w:r>
-      <w:bookmarkEnd w:id="8"/>
+        <w:t>09  Start your first interaction</w:t>
+      </w:r>
+      <w:bookmarkEnd w:id="9"/>
     </w:p>
     <w:p>
       <w:pPr>
@@ -2537,16 +2764,16 @@
       </w:pPr>
     </w:p>
     <w:p>
-      <w:bookmarkStart w:id="9" w:name="section_sticker"/>
+      <w:bookmarkStart w:id="10" w:name="section_sticker"/>
       <w:pPr>
         <w:pStyle w:val="Heading1"/>
         <w:pageBreakBefore/>
         <w:snapToGrid w:val="0"/>
       </w:pPr>
       <w:r>
-        <w:t>09  Group Sticker</w:t>
-      </w:r>
-      <w:bookmarkEnd w:id="9"/>
+        <w:t>10  Group Sticker</w:t>
+      </w:r>
+      <w:bookmarkEnd w:id="10"/>
     </w:p>
     <w:p>
       <w:pPr>
@@ -2562,15 +2789,15 @@
         <w:snapToGrid w:val="0"/>
       </w:pPr>
       <w:r>
-        <w:t>How it works</w:t>
-      </w:r>
-    </w:p>
-    <w:p>
-      <w:pPr>
-        <w:snapToGrid w:val="0"/>
-      </w:pPr>
-      <w:r>
-        <w:t>Viewers send a member’s mapped gift to support that member. This mode suits ongoing interaction without timed rounds.</w:t>
+        <w:t>When to use it</w:t>
+      </w:r>
+    </w:p>
+    <w:p>
+      <w:pPr>
+        <w:snapToGrid w:val="0"/>
+      </w:pPr>
+      <w:r>
+        <w:t>For ongoing group interaction: member gift cards keep scoring without timed rounds. Viewers support a member with that member’s mapped gift.</w:t>
       </w:r>
     </w:p>
     <w:p>
@@ -2579,7 +2806,7 @@
         <w:snapToGrid w:val="0"/>
       </w:pPr>
       <w:r>
-        <w:t>Follow these steps</w:t>
+        <w:t>How to set up</w:t>
       </w:r>
     </w:p>
     <w:p>
@@ -2620,26 +2847,6 @@
       </w:pPr>
       <w:r>
         <w:t>Use Gift Mapping to choose each member’s gift, then click Save Settings.</w:t>
-      </w:r>
-    </w:p>
-    <w:p>
-      <w:pPr>
-        <w:keepNext/>
-        <w:snapToGrid w:val="0"/>
-      </w:pPr>
-      <w:r>
-        <w:rPr>
-          <w:b/>
-        </w:rPr>
-        <w:t>3. Start the mode</w:t>
-      </w:r>
-    </w:p>
-    <w:p>
-      <w:pPr>
-        <w:snapToGrid w:val="0"/>
-      </w:pPr>
-      <w:r>
-        <w:t>Return to the mode panel and click ▶ Play. Check the member scores when mapped gifts arrive.</w:t>
       </w:r>
     </w:p>
     <w:p>
@@ -2665,7 +2872,7 @@
       <w:r>
         <w:drawing>
           <wp:inline xmlns:a="http://schemas.openxmlformats.org/drawingml/2006/main" xmlns:pic="http://schemas.openxmlformats.org/drawingml/2006/picture">
-            <wp:extent cx="5247266" cy="3291840"/>
+            <wp:extent cx="4518479" cy="2834640"/>
             <wp:docPr id="10" name="Picture 10" descr="Group Sticker settings"/>
             <wp:cNvGraphicFramePr>
               <a:graphicFrameLocks noChangeAspect="1"/>
@@ -2686,7 +2893,7 @@
                   <pic:spPr>
                     <a:xfrm>
                       <a:off x="0" y="0"/>
-                      <a:ext cx="5247266" cy="3291840"/>
+                      <a:ext cx="4518479" cy="2834640"/>
                     </a:xfrm>
                     <a:prstGeom prst="rect"/>
                   </pic:spPr>
@@ -2709,15 +2916,6 @@
     </w:p>
     <w:p>
       <w:pPr>
-        <w:pStyle w:val="Heading2"/>
-        <w:snapToGrid w:val="0"/>
-      </w:pPr>
-      <w:r>
-        <w:t>Read the settings</w:t>
-      </w:r>
-    </w:p>
-    <w:p>
-      <w:pPr>
         <w:snapToGrid w:val="0"/>
       </w:pPr>
       <w:r>
@@ -2760,16 +2958,33 @@
     </w:p>
     <w:p>
       <w:pPr>
+        <w:pStyle w:val="Heading2"/>
+        <w:snapToGrid w:val="0"/>
+      </w:pPr>
+      <w:r>
+        <w:t>How to start</w:t>
+      </w:r>
+    </w:p>
+    <w:p>
+      <w:pPr>
         <w:snapToGrid w:val="0"/>
       </w:pPr>
       <w:r>
         <w:rPr>
           <w:b/>
         </w:rPr>
-        <w:t>Play</w:t>
-      </w:r>
-      <w:r>
-        <w:t xml:space="preserve"> — Play starts continuous scoring. There is no separate Start round.</w:t>
+        <w:t xml:space="preserve">Before starting: </w:t>
+      </w:r>
+      <w:r>
+        <w:t>Check the displayed members, each mapped gift and the overlay position in OBS. This mode has no round timer.</w:t>
+      </w:r>
+    </w:p>
+    <w:p>
+      <w:pPr>
+        <w:snapToGrid w:val="0"/>
+      </w:pPr>
+      <w:r>
+        <w:t>Return to the mode panel and click ▶ Play. Check the member scores when mapped gifts arrive.</w:t>
       </w:r>
     </w:p>
     <w:p>
@@ -2778,36 +2993,45 @@
         <w:snapToGrid w:val="0"/>
       </w:pPr>
       <w:r>
-        <w:t>How to stop</w:t>
-      </w:r>
-    </w:p>
-    <w:p>
-      <w:pPr>
-        <w:snapToGrid w:val="0"/>
-      </w:pPr>
-      <w:r>
-        <w:t>There is no separate Start round button. Group Sticker keeps scoring after Play; stop the mode when you finish.</w:t>
-      </w:r>
-    </w:p>
-    <w:p>
-      <w:pPr>
-        <w:snapToGrid w:val="0"/>
-      </w:pPr>
-      <w:r>
-        <w:t>Check each member’s gift before starting so viewers can support the intended person.</w:t>
-      </w:r>
-    </w:p>
-    <w:p>
-      <w:bookmarkStart w:id="10" w:name="section_group"/>
+        <w:t>How to end</w:t>
+      </w:r>
+    </w:p>
+    <w:p>
+      <w:pPr>
+        <w:snapToGrid w:val="0"/>
+      </w:pPr>
+      <w:r>
+        <w:t>Stop Group Sticker from the mode panel when finished. There is no separate round to end.</w:t>
+      </w:r>
+    </w:p>
+    <w:p>
+      <w:pPr>
+        <w:pStyle w:val="Heading2"/>
+        <w:snapToGrid w:val="0"/>
+      </w:pPr>
+      <w:r>
+        <w:t>How to continue</w:t>
+      </w:r>
+    </w:p>
+    <w:p>
+      <w:pPr>
+        <w:snapToGrid w:val="0"/>
+      </w:pPr>
+      <w:r>
+        <w:t>Group Sticker has no next round. Keep the mode running to continue. To change members or gifts, stop it, update and save settings, then click ▶ Play again.</w:t>
+      </w:r>
+    </w:p>
+    <w:p>
+      <w:bookmarkStart w:id="11" w:name="section_group"/>
       <w:pPr>
         <w:pStyle w:val="Heading1"/>
         <w:pageBreakBefore/>
         <w:snapToGrid w:val="0"/>
       </w:pPr>
       <w:r>
-        <w:t>10  Group PK</w:t>
-      </w:r>
-      <w:bookmarkEnd w:id="10"/>
+        <w:t>11  Group PK</w:t>
+      </w:r>
+      <w:bookmarkEnd w:id="11"/>
     </w:p>
     <w:p>
       <w:pPr>
@@ -2823,15 +3047,15 @@
         <w:snapToGrid w:val="0"/>
       </w:pPr>
       <w:r>
-        <w:t>How it works</w:t>
-      </w:r>
-    </w:p>
-    <w:p>
-      <w:pPr>
-        <w:snapToGrid w:val="0"/>
-      </w:pPr>
-      <w:r>
-        <w:t>Members join the same timed round. Viewers support them with mapped gifts; use the round scores to review the result.</w:t>
+        <w:t>When to use it</w:t>
+      </w:r>
+    </w:p>
+    <w:p>
+      <w:pPr>
+        <w:snapToGrid w:val="0"/>
+      </w:pPr>
+      <w:r>
+        <w:t>For timed contests with several members competing together. Viewers send mapped gifts, and the round scores show the result.</w:t>
       </w:r>
     </w:p>
     <w:p>
@@ -2840,7 +3064,7 @@
         <w:snapToGrid w:val="0"/>
       </w:pPr>
       <w:r>
-        <w:t>Follow these steps</w:t>
+        <w:t>How to set up</w:t>
       </w:r>
     </w:p>
     <w:p>
@@ -2881,26 +3105,6 @@
       </w:pPr>
       <w:r>
         <w:t>Choose representative gifts in Gift Mapping, then click Save Settings.</w:t>
-      </w:r>
-    </w:p>
-    <w:p>
-      <w:pPr>
-        <w:keepNext/>
-        <w:snapToGrid w:val="0"/>
-      </w:pPr>
-      <w:r>
-        <w:rPr>
-          <w:b/>
-        </w:rPr>
-        <w:t>3. Start the round</w:t>
-      </w:r>
-    </w:p>
-    <w:p>
-      <w:pPr>
-        <w:snapToGrid w:val="0"/>
-      </w:pPr>
-      <w:r>
-        <w:t>Click ▶ Play to enter the mode, then Start round to begin the countdown.</w:t>
       </w:r>
     </w:p>
     <w:p>
@@ -2926,7 +3130,7 @@
       <w:r>
         <w:drawing>
           <wp:inline xmlns:a="http://schemas.openxmlformats.org/drawingml/2006/main" xmlns:pic="http://schemas.openxmlformats.org/drawingml/2006/picture">
-            <wp:extent cx="5247266" cy="3291840"/>
+            <wp:extent cx="4518479" cy="2834640"/>
             <wp:docPr id="11" name="Picture 11" descr="Group PK settings"/>
             <wp:cNvGraphicFramePr>
               <a:graphicFrameLocks noChangeAspect="1"/>
@@ -2947,7 +3151,7 @@
                   <pic:spPr>
                     <a:xfrm>
                       <a:off x="0" y="0"/>
-                      <a:ext cx="5247266" cy="3291840"/>
+                      <a:ext cx="4518479" cy="2834640"/>
                     </a:xfrm>
                     <a:prstGeom prst="rect"/>
                   </pic:spPr>
@@ -2970,15 +3174,6 @@
     </w:p>
     <w:p>
       <w:pPr>
-        <w:pStyle w:val="Heading2"/>
-        <w:snapToGrid w:val="0"/>
-      </w:pPr>
-      <w:r>
-        <w:t>Read the settings</w:t>
-      </w:r>
-    </w:p>
-    <w:p>
-      <w:pPr>
         <w:snapToGrid w:val="0"/>
       </w:pPr>
       <w:r>
@@ -3021,16 +3216,33 @@
     </w:p>
     <w:p>
       <w:pPr>
+        <w:pStyle w:val="Heading2"/>
+        <w:snapToGrid w:val="0"/>
+      </w:pPr>
+      <w:r>
+        <w:t>How to start</w:t>
+      </w:r>
+    </w:p>
+    <w:p>
+      <w:pPr>
         <w:snapToGrid w:val="0"/>
       </w:pPr>
       <w:r>
         <w:rPr>
           <w:b/>
         </w:rPr>
-        <w:t>Save Settings → Play → Start round</w:t>
-      </w:r>
-      <w:r>
-        <w:t xml:space="preserve"> — Save the setup, open the game, then start the timed round.</w:t>
+        <w:t xml:space="preserve">Before starting: </w:t>
+      </w:r>
+      <w:r>
+        <w:t>Check participants, mapped gifts, Round Timer and the OBS overlay before starting.</w:t>
+      </w:r>
+    </w:p>
+    <w:p>
+      <w:pPr>
+        <w:snapToGrid w:val="0"/>
+      </w:pPr>
+      <w:r>
+        <w:t>Click ▶ Play to enter the mode, then Start round to begin the countdown.</w:t>
       </w:r>
     </w:p>
     <w:p>
@@ -3039,36 +3251,45 @@
         <w:snapToGrid w:val="0"/>
       </w:pPr>
       <w:r>
-        <w:t>Ending the round and continuing</w:t>
-      </w:r>
-    </w:p>
-    <w:p>
-      <w:pPr>
-        <w:snapToGrid w:val="0"/>
-      </w:pPr>
-      <w:r>
-        <w:t>The timer or End round ends the round. After an 8-second buffer, click Start round to begin another round.</w:t>
-      </w:r>
-    </w:p>
-    <w:p>
-      <w:pPr>
-        <w:snapToGrid w:val="0"/>
-      </w:pPr>
-      <w:r>
-        <w:t>Group PK does not automatically eliminate or replace members using Multi PK rules.</w:t>
-      </w:r>
-    </w:p>
-    <w:p>
-      <w:bookmarkStart w:id="11" w:name="section_one"/>
+        <w:t>How to end</w:t>
+      </w:r>
+    </w:p>
+    <w:p>
+      <w:pPr>
+        <w:snapToGrid w:val="0"/>
+      </w:pPr>
+      <w:r>
+        <w:t>Let the timer finish, or click End round, then review the result.</w:t>
+      </w:r>
+    </w:p>
+    <w:p>
+      <w:pPr>
+        <w:pStyle w:val="Heading2"/>
+        <w:snapToGrid w:val="0"/>
+      </w:pPr>
+      <w:r>
+        <w:t>How to continue</w:t>
+      </w:r>
+    </w:p>
+    <w:p>
+      <w:pPr>
+        <w:snapToGrid w:val="0"/>
+      </w:pPr>
+      <w:r>
+        <w:t>Wait for the 8-second buffer, then click Start round. Members are not automatically eliminated or replaced under Multi PK rules.</w:t>
+      </w:r>
+    </w:p>
+    <w:p>
+      <w:bookmarkStart w:id="12" w:name="section_one"/>
       <w:pPr>
         <w:pStyle w:val="Heading1"/>
         <w:pageBreakBefore/>
         <w:snapToGrid w:val="0"/>
       </w:pPr>
       <w:r>
-        <w:t>11  1v1 PK</w:t>
-      </w:r>
-      <w:bookmarkEnd w:id="11"/>
+        <w:t>12  1v1 PK</w:t>
+      </w:r>
+      <w:bookmarkEnd w:id="12"/>
     </w:p>
     <w:p>
       <w:pPr>
@@ -3084,15 +3305,15 @@
         <w:snapToGrid w:val="0"/>
       </w:pPr>
       <w:r>
-        <w:t>How it works</w:t>
-      </w:r>
-    </w:p>
-    <w:p>
-      <w:pPr>
-        <w:snapToGrid w:val="0"/>
-      </w:pPr>
-      <w:r>
-        <w:t>The first two queued members take the LEFT and RIGHT positions. Viewers send the gifts mapped to each member.</w:t>
+        <w:t>When to use it</w:t>
+      </w:r>
+    </w:p>
+    <w:p>
+      <w:pPr>
+        <w:snapToGrid w:val="0"/>
+      </w:pPr>
+      <w:r>
+        <w:t>For head-to-head contests with a waiting queue. The first two members take LEFT / RIGHT; viewers support them with mapped gifts, and the winner stays.</w:t>
       </w:r>
     </w:p>
     <w:p>
@@ -3101,7 +3322,7 @@
         <w:snapToGrid w:val="0"/>
       </w:pPr>
       <w:r>
-        <w:t>Follow these steps</w:t>
+        <w:t>How to set up</w:t>
       </w:r>
     </w:p>
     <w:p>
@@ -3113,15 +3334,15 @@
         <w:rPr>
           <w:b/>
         </w:rPr>
-        <w:t>1. Arrange the queue</w:t>
-      </w:r>
-    </w:p>
-    <w:p>
-      <w:pPr>
-        <w:snapToGrid w:val="0"/>
-      </w:pPr>
-      <w:r>
-        <w:t>Select members in settings and save. Back in the mode panel, drag members in ROUND QUEUE to set the order. The first two play first.</w:t>
+        <w:t>1. Select participants</w:t>
+      </w:r>
+    </w:p>
+    <w:p>
+      <w:pPr>
+        <w:snapToGrid w:val="0"/>
+      </w:pPr>
+      <w:r>
+        <w:t>Open settings and select the competing and waiting members.</w:t>
       </w:r>
     </w:p>
     <w:p>
@@ -3142,26 +3363,6 @@
       </w:pPr>
       <w:r>
         <w:t>Set the round duration and map each participant’s gift. Click Save Settings.</w:t>
-      </w:r>
-    </w:p>
-    <w:p>
-      <w:pPr>
-        <w:keepNext/>
-        <w:snapToGrid w:val="0"/>
-      </w:pPr>
-      <w:r>
-        <w:rPr>
-          <w:b/>
-        </w:rPr>
-        <w:t>3. Start the match</w:t>
-      </w:r>
-    </w:p>
-    <w:p>
-      <w:pPr>
-        <w:snapToGrid w:val="0"/>
-      </w:pPr>
-      <w:r>
-        <w:t>Click ▶ Play, then Start round.</w:t>
       </w:r>
     </w:p>
     <w:p>
@@ -3187,7 +3388,7 @@
       <w:r>
         <w:drawing>
           <wp:inline xmlns:a="http://schemas.openxmlformats.org/drawingml/2006/main" xmlns:pic="http://schemas.openxmlformats.org/drawingml/2006/picture">
-            <wp:extent cx="5247266" cy="3291840"/>
+            <wp:extent cx="4518479" cy="2834640"/>
             <wp:docPr id="12" name="Picture 12" descr="1v1 PK settings"/>
             <wp:cNvGraphicFramePr>
               <a:graphicFrameLocks noChangeAspect="1"/>
@@ -3208,7 +3409,7 @@
                   <pic:spPr>
                     <a:xfrm>
                       <a:off x="0" y="0"/>
-                      <a:ext cx="5247266" cy="3291840"/>
+                      <a:ext cx="4518479" cy="2834640"/>
                     </a:xfrm>
                     <a:prstGeom prst="rect"/>
                   </pic:spPr>
@@ -3239,7 +3440,7 @@
       <w:r>
         <w:drawing>
           <wp:inline xmlns:a="http://schemas.openxmlformats.org/drawingml/2006/main" xmlns:pic="http://schemas.openxmlformats.org/drawingml/2006/picture">
-            <wp:extent cx="5247266" cy="3291840"/>
+            <wp:extent cx="4518479" cy="2834640"/>
             <wp:docPr id="13" name="Picture 13" descr="1v1 PK settings 2 of 2: member gifts and Save Settings"/>
             <wp:cNvGraphicFramePr>
               <a:graphicFrameLocks noChangeAspect="1"/>
@@ -3260,7 +3461,7 @@
                   <pic:spPr>
                     <a:xfrm>
                       <a:off x="0" y="0"/>
-                      <a:ext cx="5247266" cy="3291840"/>
+                      <a:ext cx="4518479" cy="2834640"/>
                     </a:xfrm>
                     <a:prstGeom prst="rect"/>
                   </pic:spPr>
@@ -3283,15 +3484,6 @@
     </w:p>
     <w:p>
       <w:pPr>
-        <w:pStyle w:val="Heading2"/>
-        <w:snapToGrid w:val="0"/>
-      </w:pPr>
-      <w:r>
-        <w:t>Read the settings</w:t>
-      </w:r>
-    </w:p>
-    <w:p>
-      <w:pPr>
         <w:snapToGrid w:val="0"/>
       </w:pPr>
       <w:r>
@@ -3362,16 +3554,33 @@
     </w:p>
     <w:p>
       <w:pPr>
+        <w:pStyle w:val="Heading2"/>
+        <w:snapToGrid w:val="0"/>
+      </w:pPr>
+      <w:r>
+        <w:t>How to start</w:t>
+      </w:r>
+    </w:p>
+    <w:p>
+      <w:pPr>
         <w:snapToGrid w:val="0"/>
       </w:pPr>
       <w:r>
         <w:rPr>
           <w:b/>
         </w:rPr>
-        <w:t>Save Settings → Play → Start round</w:t>
-      </w:r>
-      <w:r>
-        <w:t xml:space="preserve"> — Save, open the game and begin the matchup.</w:t>
+        <w:t xml:space="preserve">Before starting: </w:t>
+      </w:r>
+      <w:r>
+        <w:t>Check ROUND QUEUE order, LEFT / RIGHT members, mapped gifts, Round Timer and the OBS overlay.</w:t>
+      </w:r>
+    </w:p>
+    <w:p>
+      <w:pPr>
+        <w:snapToGrid w:val="0"/>
+      </w:pPr>
+      <w:r>
+        <w:t>Save and click ▶ Play. Drag members in ROUND QUEUE on the mode panel; the first two play first. Check LEFT / RIGHT, then click Start round.</w:t>
       </w:r>
     </w:p>
     <w:p>
@@ -3380,15 +3589,32 @@
         <w:snapToGrid w:val="0"/>
       </w:pPr>
       <w:r>
-        <w:t>Ending the round and continuing</w:t>
-      </w:r>
-    </w:p>
-    <w:p>
-      <w:pPr>
-        <w:snapToGrid w:val="0"/>
-      </w:pPr>
-      <w:r>
-        <w:t>The winner stays on the same side. The loser moves to the end of the queue and the next waiting member enters. A tie keeps the same matchup. With only two members, there is no replacement.</w:t>
+        <w:t>How to end</w:t>
+      </w:r>
+    </w:p>
+    <w:p>
+      <w:pPr>
+        <w:snapToGrid w:val="0"/>
+      </w:pPr>
+      <w:r>
+        <w:t>Let the timer finish, or click End round, then review the matchup result.</w:t>
+      </w:r>
+    </w:p>
+    <w:p>
+      <w:pPr>
+        <w:pStyle w:val="Heading2"/>
+        <w:snapToGrid w:val="0"/>
+      </w:pPr>
+      <w:r>
+        <w:t>How to continue</w:t>
+      </w:r>
+    </w:p>
+    <w:p>
+      <w:pPr>
+        <w:snapToGrid w:val="0"/>
+      </w:pPr>
+      <w:r>
+        <w:t>The winner stays on the same side, the loser moves to the queue end, and the next waiting member enters. Check the matchup, then click Start round. A tie keeps the matchup; with only two members there is no replacement.</w:t>
       </w:r>
     </w:p>
     <w:p>
@@ -3400,16 +3626,16 @@
       </w:r>
     </w:p>
     <w:p>
-      <w:bookmarkStart w:id="12" w:name="section_solo"/>
+      <w:bookmarkStart w:id="13" w:name="section_solo"/>
       <w:pPr>
         <w:pStyle w:val="Heading1"/>
         <w:pageBreakBefore/>
         <w:snapToGrid w:val="0"/>
       </w:pPr>
       <w:r>
-        <w:t>12  Solo Stage</w:t>
-      </w:r>
-      <w:bookmarkEnd w:id="12"/>
+        <w:t>13  Solo Stage</w:t>
+      </w:r>
+      <w:bookmarkEnd w:id="13"/>
     </w:p>
     <w:p>
       <w:pPr>
@@ -3425,15 +3651,15 @@
         <w:snapToGrid w:val="0"/>
       </w:pPr>
       <w:r>
-        <w:t>How it works</w:t>
-      </w:r>
-    </w:p>
-    <w:p>
-      <w:pPr>
-        <w:snapToGrid w:val="0"/>
-      </w:pPr>
-      <w:r>
-        <w:t>One member performs at a time. Eligible support is credited to the active member. Choose Target or Freedom.</w:t>
+        <w:t>When to use it</w:t>
+      </w:r>
+    </w:p>
+    <w:p>
+      <w:pPr>
+        <w:snapToGrid w:val="0"/>
+      </w:pPr>
+      <w:r>
+        <w:t>For solo performances or target challenges. One member takes the stage at a time and receives eligible support. Choose Target or Freedom.</w:t>
       </w:r>
     </w:p>
     <w:p>
@@ -3442,7 +3668,7 @@
         <w:snapToGrid w:val="0"/>
       </w:pPr>
       <w:r>
-        <w:t>Follow these steps</w:t>
+        <w:t>How to set up</w:t>
       </w:r>
     </w:p>
     <w:p>
@@ -3488,26 +3714,6 @@
     <w:p>
       <w:pPr>
         <w:keepNext/>
-        <w:snapToGrid w:val="0"/>
-      </w:pPr>
-      <w:r>
-        <w:rPr>
-          <w:b/>
-        </w:rPr>
-        <w:t>3. Start the stage</w:t>
-      </w:r>
-    </w:p>
-    <w:p>
-      <w:pPr>
-        <w:snapToGrid w:val="0"/>
-      </w:pPr>
-      <w:r>
-        <w:t>Save settings, click ▶ Play, then Start for the active member.</w:t>
-      </w:r>
-    </w:p>
-    <w:p>
-      <w:pPr>
-        <w:keepNext/>
         <w:spacing w:after="60" w:line="240" w:lineRule="auto"/>
         <w:jc w:val="center"/>
         <w:snapToGrid w:val="0"/>
@@ -3515,7 +3721,7 @@
       <w:r>
         <w:drawing>
           <wp:inline xmlns:a="http://schemas.openxmlformats.org/drawingml/2006/main" xmlns:pic="http://schemas.openxmlformats.org/drawingml/2006/picture">
-            <wp:extent cx="5247266" cy="3291840"/>
+            <wp:extent cx="4518479" cy="2834640"/>
             <wp:docPr id="14" name="Picture 14" descr="Solo Stage settings"/>
             <wp:cNvGraphicFramePr>
               <a:graphicFrameLocks noChangeAspect="1"/>
@@ -3536,7 +3742,7 @@
                   <pic:spPr>
                     <a:xfrm>
                       <a:off x="0" y="0"/>
-                      <a:ext cx="5247266" cy="3291840"/>
+                      <a:ext cx="4518479" cy="2834640"/>
                     </a:xfrm>
                     <a:prstGeom prst="rect"/>
                   </pic:spPr>
@@ -3567,7 +3773,7 @@
       <w:r>
         <w:drawing>
           <wp:inline xmlns:a="http://schemas.openxmlformats.org/drawingml/2006/main" xmlns:pic="http://schemas.openxmlformats.org/drawingml/2006/picture">
-            <wp:extent cx="5247266" cy="3291840"/>
+            <wp:extent cx="4518479" cy="2834640"/>
             <wp:docPr id="15" name="Picture 15" descr="Solo Stage: Freedom and Avatar settings"/>
             <wp:cNvGraphicFramePr>
               <a:graphicFrameLocks noChangeAspect="1"/>
@@ -3588,7 +3794,7 @@
                   <pic:spPr>
                     <a:xfrm>
                       <a:off x="0" y="0"/>
-                      <a:ext cx="5247266" cy="3291840"/>
+                      <a:ext cx="4518479" cy="2834640"/>
                     </a:xfrm>
                     <a:prstGeom prst="rect"/>
                   </pic:spPr>
@@ -3611,15 +3817,6 @@
     </w:p>
     <w:p>
       <w:pPr>
-        <w:pStyle w:val="Heading2"/>
-        <w:snapToGrid w:val="0"/>
-      </w:pPr>
-      <w:r>
-        <w:t>Read the settings</w:t>
-      </w:r>
-    </w:p>
-    <w:p>
-      <w:pPr>
         <w:snapToGrid w:val="0"/>
       </w:pPr>
       <w:r>
@@ -3676,16 +3873,33 @@
     </w:p>
     <w:p>
       <w:pPr>
+        <w:pStyle w:val="Heading2"/>
+        <w:snapToGrid w:val="0"/>
+      </w:pPr>
+      <w:r>
+        <w:t>How to start</w:t>
+      </w:r>
+    </w:p>
+    <w:p>
+      <w:pPr>
         <w:snapToGrid w:val="0"/>
       </w:pPr>
       <w:r>
         <w:rPr>
           <w:b/>
         </w:rPr>
-        <w:t>Save Settings → Play → Start</w:t>
-      </w:r>
-      <w:r>
-        <w:t xml:space="preserve"> — Save and open the mode, then Start. After the round, Start again rotates to the next member.</w:t>
+        <w:t xml:space="preserve">Before starting: </w:t>
+      </w:r>
+      <w:r>
+        <w:t>Check the active member, queue order, timer and OBS overlay. In Target mode, check that A is lower than B.</w:t>
+      </w:r>
+    </w:p>
+    <w:p>
+      <w:pPr>
+        <w:snapToGrid w:val="0"/>
+      </w:pPr>
+      <w:r>
+        <w:t>Save settings, click ▶ Play, then Start for the active member.</w:t>
       </w:r>
     </w:p>
     <w:p>
@@ -3694,36 +3908,45 @@
         <w:snapToGrid w:val="0"/>
       </w:pPr>
       <w:r>
-        <w:t>Ending the round and continuing</w:t>
-      </w:r>
-    </w:p>
-    <w:p>
-      <w:pPr>
-        <w:snapToGrid w:val="0"/>
-      </w:pPr>
-      <w:r>
-        <w:t>When the timer ends or you end the round, the result stays visible. The next Start rotates to the next member. Reaching a target does not automatically change the member.</w:t>
-      </w:r>
-    </w:p>
-    <w:p>
-      <w:pPr>
-        <w:snapToGrid w:val="0"/>
-      </w:pPr>
-      <w:r>
-        <w:t>Some settings are locked during a live round. End the round before changing them.</w:t>
-      </w:r>
-    </w:p>
-    <w:p>
-      <w:bookmarkStart w:id="13" w:name="section_multi"/>
+        <w:t>How to end</w:t>
+      </w:r>
+    </w:p>
+    <w:p>
+      <w:pPr>
+        <w:snapToGrid w:val="0"/>
+      </w:pPr>
+      <w:r>
+        <w:t>Let the timer finish or end the round manually. The result stays visible; reaching a target does not change the active member.</w:t>
+      </w:r>
+    </w:p>
+    <w:p>
+      <w:pPr>
+        <w:pStyle w:val="Heading2"/>
+        <w:snapToGrid w:val="0"/>
+      </w:pPr>
+      <w:r>
+        <w:t>How to continue</w:t>
+      </w:r>
+    </w:p>
+    <w:p>
+      <w:pPr>
+        <w:snapToGrid w:val="0"/>
+      </w:pPr>
+      <w:r>
+        <w:t>Click Start again to rotate to the next queued member and begin the next round. End the current round before changing settings.</w:t>
+      </w:r>
+    </w:p>
+    <w:p>
+      <w:bookmarkStart w:id="14" w:name="section_multi"/>
       <w:pPr>
         <w:pStyle w:val="Heading1"/>
         <w:pageBreakBefore/>
         <w:snapToGrid w:val="0"/>
       </w:pPr>
       <w:r>
-        <w:t>13  Multi PK</w:t>
-      </w:r>
-      <w:bookmarkEnd w:id="13"/>
+        <w:t>14  Multi PK</w:t>
+      </w:r>
+      <w:bookmarkEnd w:id="14"/>
     </w:p>
     <w:p>
       <w:pPr>
@@ -3739,15 +3962,15 @@
         <w:snapToGrid w:val="0"/>
       </w:pPr>
       <w:r>
-        <w:t>How it works</w:t>
-      </w:r>
-    </w:p>
-    <w:p>
-      <w:pPr>
-        <w:snapToGrid w:val="0"/>
-      </w:pPr>
-      <w:r>
-        <w:t>Members compete together. At the end of a round, the lowest-scoring member can be replaced by the next waiting member.</w:t>
+        <w:t>When to use it</w:t>
+      </w:r>
+    </w:p>
+    <w:p>
+      <w:pPr>
+        <w:snapToGrid w:val="0"/>
+      </w:pPr>
+      <w:r>
+        <w:t>For group contests with a rotating bench. Viewers send mapped gifts; round results and the bench queue determine who leaves and who enters.</w:t>
       </w:r>
     </w:p>
     <w:p>
@@ -3756,7 +3979,7 @@
         <w:snapToGrid w:val="0"/>
       </w:pPr>
       <w:r>
-        <w:t>Follow these steps</w:t>
+        <w:t>How to set up</w:t>
       </w:r>
     </w:p>
     <w:p>
@@ -3797,26 +4020,6 @@
       </w:pPr>
       <w:r>
         <w:t>Choose 10–3600 seconds. Every on-stage and bench member needs a unique representative gift. Save settings.</w:t>
-      </w:r>
-    </w:p>
-    <w:p>
-      <w:pPr>
-        <w:keepNext/>
-        <w:snapToGrid w:val="0"/>
-      </w:pPr>
-      <w:r>
-        <w:rPr>
-          <w:b/>
-        </w:rPr>
-        <w:t>3. Start the first round</w:t>
-      </w:r>
-    </w:p>
-    <w:p>
-      <w:pPr>
-        <w:snapToGrid w:val="0"/>
-      </w:pPr>
-      <w:r>
-        <w:t>Click ▶ Play, then Start round.</w:t>
       </w:r>
     </w:p>
     <w:p>
@@ -3842,7 +4045,7 @@
       <w:r>
         <w:drawing>
           <wp:inline xmlns:a="http://schemas.openxmlformats.org/drawingml/2006/main" xmlns:pic="http://schemas.openxmlformats.org/drawingml/2006/picture">
-            <wp:extent cx="5247266" cy="3291840"/>
+            <wp:extent cx="4518479" cy="2834640"/>
             <wp:docPr id="16" name="Picture 16" descr="Multi PK settings 1 of 2: timer, stage count, members and bench"/>
             <wp:cNvGraphicFramePr>
               <a:graphicFrameLocks noChangeAspect="1"/>
@@ -3863,7 +4066,7 @@
                   <pic:spPr>
                     <a:xfrm>
                       <a:off x="0" y="0"/>
-                      <a:ext cx="5247266" cy="3291840"/>
+                      <a:ext cx="4518479" cy="2834640"/>
                     </a:xfrm>
                     <a:prstGeom prst="rect"/>
                   </pic:spPr>
@@ -3894,7 +4097,7 @@
       <w:r>
         <w:drawing>
           <wp:inline xmlns:a="http://schemas.openxmlformats.org/drawingml/2006/main" xmlns:pic="http://schemas.openxmlformats.org/drawingml/2006/picture">
-            <wp:extent cx="5247266" cy="3291840"/>
+            <wp:extent cx="4518479" cy="2834640"/>
             <wp:docPr id="17" name="Picture 17" descr="Multi PK settings 2 of 2: all gift mappings and Save Settings"/>
             <wp:cNvGraphicFramePr>
               <a:graphicFrameLocks noChangeAspect="1"/>
@@ -3915,7 +4118,7 @@
                   <pic:spPr>
                     <a:xfrm>
                       <a:off x="0" y="0"/>
-                      <a:ext cx="5247266" cy="3291840"/>
+                      <a:ext cx="4518479" cy="2834640"/>
                     </a:xfrm>
                     <a:prstGeom prst="rect"/>
                   </pic:spPr>
@@ -3938,15 +4141,6 @@
     </w:p>
     <w:p>
       <w:pPr>
-        <w:pStyle w:val="Heading2"/>
-        <w:snapToGrid w:val="0"/>
-      </w:pPr>
-      <w:r>
-        <w:t>Read the settings</w:t>
-      </w:r>
-    </w:p>
-    <w:p>
-      <w:pPr>
         <w:snapToGrid w:val="0"/>
       </w:pPr>
       <w:r>
@@ -4003,16 +4197,33 @@
     </w:p>
     <w:p>
       <w:pPr>
+        <w:pStyle w:val="Heading2"/>
+        <w:snapToGrid w:val="0"/>
+      </w:pPr>
+      <w:r>
+        <w:t>How to start</w:t>
+      </w:r>
+    </w:p>
+    <w:p>
+      <w:pPr>
         <w:snapToGrid w:val="0"/>
       </w:pPr>
       <w:r>
         <w:rPr>
           <w:b/>
         </w:rPr>
-        <w:t>Save Settings → Play → Start round</w:t>
-      </w:r>
-      <w:r>
-        <w:t xml:space="preserve"> — Save, start the mode and start a round. If the lowest scores tie, choose who leaves before Next round.</w:t>
+        <w:t xml:space="preserve">Before starting: </w:t>
+      </w:r>
+      <w:r>
+        <w:t>Check that On Stage matches On-stage Count, the bench order is correct and every member has a unique gift. Check the timer and OBS overlay.</w:t>
+      </w:r>
+    </w:p>
+    <w:p>
+      <w:pPr>
+        <w:snapToGrid w:val="0"/>
+      </w:pPr>
+      <w:r>
+        <w:t>Click ▶ Play, then Start round.</w:t>
       </w:r>
     </w:p>
     <w:p>
@@ -4021,23 +4232,32 @@
         <w:snapToGrid w:val="0"/>
       </w:pPr>
       <w:r>
-        <w:t>Ending the round and continuing</w:t>
-      </w:r>
-    </w:p>
-    <w:p>
-      <w:pPr>
-        <w:snapToGrid w:val="0"/>
-      </w:pPr>
-      <w:r>
-        <w:t>With members waiting, the lowest-scoring member leaves and joins the end of the bench queue. The next waiting member enters; everyone else stays. With no bench members, no replacement occurs.</w:t>
-      </w:r>
-    </w:p>
-    <w:p>
-      <w:pPr>
-        <w:snapToGrid w:val="0"/>
-      </w:pPr>
-      <w:r>
-        <w:t>If the lowest score is tied, use Choose who leaves before the next round. A tie for highest score does not add a single-player win streak.</w:t>
+        <w:t>How to end</w:t>
+      </w:r>
+    </w:p>
+    <w:p>
+      <w:pPr>
+        <w:snapToGrid w:val="0"/>
+      </w:pPr>
+      <w:r>
+        <w:t>Let the timer finish, or click End round. Check the lowest score; if it is tied, select the departing member in Choose who leaves.</w:t>
+      </w:r>
+    </w:p>
+    <w:p>
+      <w:pPr>
+        <w:pStyle w:val="Heading2"/>
+        <w:snapToGrid w:val="0"/>
+      </w:pPr>
+      <w:r>
+        <w:t>How to continue</w:t>
+      </w:r>
+    </w:p>
+    <w:p>
+      <w:pPr>
+        <w:snapToGrid w:val="0"/>
+      </w:pPr>
+      <w:r>
+        <w:t>After confirming who leaves, click Next round. The lowest-scoring member joins the bench queue end, the next waiting member enters, and everyone else stays. With no bench, there is no replacement. A tie for highest score does not add a single-player win streak.</w:t>
       </w:r>
     </w:p>
     <w:p>
@@ -4050,7 +4270,7 @@
       <w:r>
         <w:drawing>
           <wp:inline xmlns:a="http://schemas.openxmlformats.org/drawingml/2006/main" xmlns:pic="http://schemas.openxmlformats.org/drawingml/2006/picture">
-            <wp:extent cx="5247266" cy="3291840"/>
+            <wp:extent cx="4518479" cy="2834640"/>
             <wp:docPr id="18" name="Picture 18" descr="When the lowest score is tied, choose who leaves before continuing"/>
             <wp:cNvGraphicFramePr>
               <a:graphicFrameLocks noChangeAspect="1"/>
@@ -4071,7 +4291,7 @@
                   <pic:spPr>
                     <a:xfrm>
                       <a:off x="0" y="0"/>
-                      <a:ext cx="5247266" cy="3291840"/>
+                      <a:ext cx="4518479" cy="2834640"/>
                     </a:xfrm>
                     <a:prstGeom prst="rect"/>
                   </pic:spPr>
@@ -4093,16 +4313,16 @@
       </w:r>
     </w:p>
     <w:p>
-      <w:bookmarkStart w:id="14" w:name="section_scene"/>
+      <w:bookmarkStart w:id="15" w:name="section_scene"/>
       <w:pPr>
         <w:pStyle w:val="Heading1"/>
         <w:pageBreakBefore/>
         <w:snapToGrid w:val="0"/>
       </w:pPr>
       <w:r>
-        <w:t>14  Other scene tools</w:t>
-      </w:r>
-      <w:bookmarkEnd w:id="14"/>
+        <w:t>15  Other scene tools</w:t>
+      </w:r>
+      <w:bookmarkEnd w:id="15"/>
     </w:p>
     <w:p>
       <w:pPr>
@@ -4139,7 +4359,7 @@
       <w:r>
         <w:drawing>
           <wp:inline xmlns:a="http://schemas.openxmlformats.org/drawingml/2006/main" xmlns:pic="http://schemas.openxmlformats.org/drawingml/2006/picture">
-            <wp:extent cx="5247266" cy="3291840"/>
+            <wp:extent cx="4518479" cy="2834640"/>
             <wp:docPr id="19" name="Picture 19" descr="Ranking: select game scores and Cast members to display"/>
             <wp:cNvGraphicFramePr>
               <a:graphicFrameLocks noChangeAspect="1"/>
@@ -4160,7 +4380,7 @@
                   <pic:spPr>
                     <a:xfrm>
                       <a:off x="0" y="0"/>
-                      <a:ext cx="5247266" cy="3291840"/>
+                      <a:ext cx="4518479" cy="2834640"/>
                     </a:xfrm>
                     <a:prstGeom prst="rect"/>
                   </pic:spPr>
@@ -4208,7 +4428,7 @@
       <w:r>
         <w:drawing>
           <wp:inline xmlns:a="http://schemas.openxmlformats.org/drawingml/2006/main" xmlns:pic="http://schemas.openxmlformats.org/drawingml/2006/picture">
-            <wp:extent cx="5247266" cy="3291840"/>
+            <wp:extent cx="4518479" cy="2834640"/>
             <wp:docPr id="20" name="Picture 20" descr="Lucky Wheel: one option per line and result hold time"/>
             <wp:cNvGraphicFramePr>
               <a:graphicFrameLocks noChangeAspect="1"/>
@@ -4229,7 +4449,7 @@
                   <pic:spPr>
                     <a:xfrm>
                       <a:off x="0" y="0"/>
-                      <a:ext cx="5247266" cy="3291840"/>
+                      <a:ext cx="4518479" cy="2834640"/>
                     </a:xfrm>
                     <a:prstGeom prst="rect"/>
                   </pic:spPr>
@@ -4285,7 +4505,7 @@
       <w:r>
         <w:drawing>
           <wp:inline xmlns:a="http://schemas.openxmlformats.org/drawingml/2006/main" xmlns:pic="http://schemas.openxmlformats.org/drawingml/2006/picture">
-            <wp:extent cx="5247266" cy="3291840"/>
+            <wp:extent cx="4518479" cy="2834640"/>
             <wp:docPr id="21" name="Picture 21" descr="Menu: visibility, layout, custom names and gift selection"/>
             <wp:cNvGraphicFramePr>
               <a:graphicFrameLocks noChangeAspect="1"/>
@@ -4306,7 +4526,7 @@
                   <pic:spPr>
                     <a:xfrm>
                       <a:off x="0" y="0"/>
-                      <a:ext cx="5247266" cy="3291840"/>
+                      <a:ext cx="4518479" cy="2834640"/>
                     </a:xfrm>
                     <a:prstGeom prst="rect"/>
                   </pic:spPr>
@@ -4354,7 +4574,7 @@
       <w:r>
         <w:drawing>
           <wp:inline xmlns:a="http://schemas.openxmlformats.org/drawingml/2006/main" xmlns:pic="http://schemas.openxmlformats.org/drawingml/2006/picture">
-            <wp:extent cx="5247266" cy="3291840"/>
+            <wp:extent cx="4518479" cy="2834640"/>
             <wp:docPr id="22" name="Picture 22" descr="Modes Settings: Gifter Binding switch"/>
             <wp:cNvGraphicFramePr>
               <a:graphicFrameLocks noChangeAspect="1"/>
@@ -4375,7 +4595,7 @@
                   <pic:spPr>
                     <a:xfrm>
                       <a:off x="0" y="0"/>
-                      <a:ext cx="5247266" cy="3291840"/>
+                      <a:ext cx="4518479" cy="2834640"/>
                     </a:xfrm>
                     <a:prstGeom prst="rect"/>
                   </pic:spPr>
@@ -4397,16 +4617,16 @@
       </w:r>
     </w:p>
     <w:p>
-      <w:bookmarkStart w:id="15" w:name="section_finish"/>
+      <w:bookmarkStart w:id="16" w:name="section_finish"/>
       <w:pPr>
         <w:pStyle w:val="Heading1"/>
         <w:pageBreakBefore/>
         <w:snapToGrid w:val="0"/>
       </w:pPr>
       <w:r>
-        <w:t>15  Finish and review records</w:t>
-      </w:r>
-      <w:bookmarkEnd w:id="15"/>
+        <w:t>16  Finish and review records</w:t>
+      </w:r>
+      <w:bookmarkEnd w:id="16"/>
     </w:p>
     <w:p>
       <w:pPr>
@@ -4554,30 +4774,16 @@
       </w:r>
     </w:p>
     <w:p>
-      <w:pPr>
-        <w:snapToGrid w:val="0"/>
-      </w:pPr>
-      <w:r>
-        <w:rPr>
-          <w:b/>
-        </w:rPr>
-        <w:t xml:space="preserve">Check after finishing: </w:t>
-      </w:r>
-      <w:r>
-        <w:t>The game has stopped, Studio is disconnected, and the broadcast has ended in your streaming software.</w:t>
-      </w:r>
-    </w:p>
-    <w:p>
-      <w:bookmarkStart w:id="16" w:name="section_help"/>
+      <w:bookmarkStart w:id="17" w:name="section_help"/>
       <w:pPr>
         <w:pStyle w:val="Heading1"/>
         <w:pageBreakBefore/>
         <w:snapToGrid w:val="0"/>
       </w:pPr>
       <w:r>
-        <w:t>16  Troubleshooting</w:t>
-      </w:r>
-      <w:bookmarkEnd w:id="16"/>
+        <w:t>17  Troubleshooting</w:t>
+      </w:r>
+      <w:bookmarkEnd w:id="17"/>
     </w:p>
     <w:p>
       <w:pPr>
@@ -4721,6 +4927,23 @@
       </w:pPr>
       <w:r>
         <w:t>Reaching a target does not rotate members. End the round, then click the next Start.</w:t>
+      </w:r>
+    </w:p>
+    <w:p>
+      <w:pPr>
+        <w:pStyle w:val="Heading2"/>
+        <w:snapToGrid w:val="0"/>
+      </w:pPr>
+      <w:r>
+        <w:t>Why does the game not appear in OBS after starting</w:t>
+      </w:r>
+    </w:p>
+    <w:p>
+      <w:pPr>
+        <w:snapToGrid w:val="0"/>
+      </w:pPr>
+      <w:r>
+        <w:t>If you have clicked Play / Start / Start round but the game overlay does not appear in OBS, select the Streamplay Browser Source in OBS Sources, open Properties, and click Refresh cache of current page. Then check the overlay again. Refresh the Browser Source, not the camera source.</w:t>
       </w:r>
     </w:p>
     <w:sectPr>
@@ -4746,7 +4969,7 @@
       <w:rPr>
         <w:sz w:val="16"/>
       </w:rPr>
-      <w:t xml:space="preserve">2026-10-22 · 13   |   </w:t>
+      <w:t xml:space="preserve">2026-10-22 · 14   |   </w:t>
     </w:r>
     <w:fldSimple w:instr="PAGE"/>
   </w:p>
@@ -5133,7 +5356,7 @@
     <w:qFormat/>
     <w:rsid w:val="00FC693F"/>
     <w:pPr>
-      <w:spacing w:after="100" w:line="300" w:lineRule="exact"/>
+      <w:spacing w:after="80" w:line="300" w:lineRule="exact"/>
     </w:pPr>
     <w:rPr>
       <w:rFonts w:ascii="Arial" w:hAnsi="Arial" w:eastAsia="Heiti SC"/>
@@ -5529,7 +5752,7 @@
       <w:numPr>
         <w:ilvl w:val="1"/>
       </w:numPr>
-      <w:spacing w:after="100" w:line="280" w:lineRule="exact"/>
+      <w:spacing w:after="80" w:line="280" w:lineRule="exact"/>
     </w:pPr>
     <w:rPr>
       <w:rFonts w:ascii="Arial" w:hAnsi="Arial" w:eastAsia="Heiti SC"/>
@@ -5674,7 +5897,7 @@
       <w:numPr>
         <w:numId w:val="1"/>
       </w:numPr>
-      <w:spacing w:after="100" w:line="280" w:lineRule="exact"/>
+      <w:spacing w:after="80" w:line="280" w:lineRule="exact"/>
       <w:contextualSpacing/>
     </w:pPr>
     <w:rPr>
@@ -5941,7 +6164,7 @@
     <w:qFormat/>
     <w:rsid w:val="00FC693F"/>
     <w:pPr>
-      <w:spacing w:line="280" w:lineRule="exact" w:after="100"/>
+      <w:spacing w:line="280" w:lineRule="exact" w:after="80"/>
     </w:pPr>
     <w:rPr>
       <w:rFonts w:ascii="Arial" w:hAnsi="Arial" w:eastAsia="Heiti SC"/>

</xml_diff>